<commit_message>
fix typo in resume
</commit_message>
<xml_diff>
--- a/files/resume.docx
+++ b/files/resume.docx
@@ -11,7 +11,7 @@
         </w:numPr>
         <w:bidi w:val="0"/>
         <w:spacing w:before="58" w:after="58"/>
-        <w:ind w:hanging="0" w:left="0" w:right="0"/>
+        <w:ind w:hanging="0" w:start="0" w:end="0"/>
         <w:rPr/>
       </w:pPr>
       <w:r>
@@ -23,8 +23,8 @@
       <w:pPr>
         <w:pStyle w:val="Normal"/>
         <w:bidi w:val="0"/>
-        <w:ind w:hanging="0" w:left="0" w:right="0"/>
-        <w:jc w:val="left"/>
+        <w:ind w:hanging="0" w:start="0" w:end="0"/>
+        <w:jc w:val="start"/>
         <w:rPr>
           <w:sz w:val="22"/>
           <w:szCs w:val="22"/>
@@ -43,8 +43,8 @@
       <w:pPr>
         <w:pStyle w:val="Normal"/>
         <w:bidi w:val="0"/>
-        <w:ind w:hanging="0" w:left="0" w:right="0"/>
-        <w:jc w:val="left"/>
+        <w:ind w:hanging="0" w:start="0" w:end="0"/>
+        <w:jc w:val="start"/>
         <w:rPr>
           <w:sz w:val="22"/>
           <w:szCs w:val="22"/>
@@ -63,8 +63,8 @@
       <w:pPr>
         <w:pStyle w:val="Normal"/>
         <w:bidi w:val="0"/>
-        <w:ind w:hanging="0" w:left="0" w:right="0"/>
-        <w:jc w:val="left"/>
+        <w:ind w:hanging="0" w:start="0" w:end="0"/>
+        <w:jc w:val="start"/>
         <w:rPr>
           <w:sz w:val="12"/>
           <w:szCs w:val="12"/>
@@ -145,10 +145,9 @@
       <w:pPr>
         <w:pStyle w:val="Heading3"/>
         <w:bidi w:val="0"/>
-        <w:ind w:hanging="0" w:left="72"/>
-        <w:jc w:val="left"/>
-        <w:rPr>
-          <w:i w:val="false"/>
+        <w:ind w:hanging="0" w:start="72"/>
+        <w:jc w:val="start"/>
+        <w:rPr>
           <w:i w:val="false"/>
           <w:iCs w:val="false"/>
         </w:rPr>
@@ -165,7 +164,7 @@
       <w:pPr>
         <w:pStyle w:val="Normal"/>
         <w:bidi w:val="0"/>
-        <w:jc w:val="left"/>
+        <w:jc w:val="start"/>
         <w:rPr>
           <w:sz w:val="22"/>
           <w:szCs w:val="22"/>
@@ -183,7 +182,7 @@
       <w:pPr>
         <w:pStyle w:val="Normal"/>
         <w:bidi w:val="0"/>
-        <w:jc w:val="left"/>
+        <w:jc w:val="start"/>
         <w:rPr>
           <w:sz w:val="22"/>
           <w:szCs w:val="22"/>
@@ -201,7 +200,7 @@
       <w:pPr>
         <w:pStyle w:val="Normal"/>
         <w:bidi w:val="0"/>
-        <w:jc w:val="left"/>
+        <w:jc w:val="start"/>
         <w:rPr>
           <w:sz w:val="22"/>
           <w:szCs w:val="22"/>
@@ -219,7 +218,7 @@
       <w:pPr>
         <w:pStyle w:val="Normal"/>
         <w:bidi w:val="0"/>
-        <w:jc w:val="left"/>
+        <w:jc w:val="start"/>
         <w:rPr>
           <w:sz w:val="22"/>
           <w:szCs w:val="22"/>
@@ -237,7 +236,7 @@
       <w:pPr>
         <w:pStyle w:val="Normal"/>
         <w:bidi w:val="0"/>
-        <w:jc w:val="left"/>
+        <w:jc w:val="start"/>
         <w:rPr>
           <w:sz w:val="22"/>
           <w:szCs w:val="22"/>
@@ -255,7 +254,7 @@
       <w:pPr>
         <w:pStyle w:val="Normal"/>
         <w:bidi w:val="0"/>
-        <w:jc w:val="left"/>
+        <w:jc w:val="start"/>
         <w:rPr>
           <w:sz w:val="22"/>
           <w:szCs w:val="22"/>
@@ -284,7 +283,7 @@
       <w:pPr>
         <w:pStyle w:val="Normal"/>
         <w:bidi w:val="0"/>
-        <w:jc w:val="left"/>
+        <w:jc w:val="start"/>
         <w:rPr>
           <w:sz w:val="22"/>
           <w:szCs w:val="22"/>
@@ -302,12 +301,11 @@
       <w:pPr>
         <w:pStyle w:val="Normal"/>
         <w:bidi w:val="0"/>
-        <w:jc w:val="left"/>
+        <w:jc w:val="start"/>
         <w:rPr>
           <w:rFonts w:ascii="Open Sans" w:hAnsi="Open Sans"/>
           <w:b w:val="false"/>
           <w:bCs w:val="false"/>
-          <w:i w:val="false"/>
           <w:i w:val="false"/>
           <w:iCs w:val="false"/>
           <w:sz w:val="22"/>
@@ -330,7 +328,7 @@
       <w:pPr>
         <w:pStyle w:val="Normal"/>
         <w:bidi w:val="0"/>
-        <w:jc w:val="left"/>
+        <w:jc w:val="start"/>
         <w:rPr>
           <w:sz w:val="22"/>
           <w:szCs w:val="22"/>
@@ -352,12 +350,11 @@
       <w:pPr>
         <w:pStyle w:val="Normal"/>
         <w:bidi w:val="0"/>
-        <w:jc w:val="left"/>
+        <w:jc w:val="start"/>
         <w:rPr>
           <w:rFonts w:ascii="Open Sans" w:hAnsi="Open Sans"/>
           <w:b w:val="false"/>
           <w:bCs w:val="false"/>
-          <w:i w:val="false"/>
           <w:i w:val="false"/>
           <w:iCs w:val="false"/>
           <w:sz w:val="22"/>
@@ -380,12 +377,11 @@
       <w:pPr>
         <w:pStyle w:val="Normal"/>
         <w:bidi w:val="0"/>
-        <w:jc w:val="left"/>
+        <w:jc w:val="start"/>
         <w:rPr>
           <w:rFonts w:ascii="Open Sans" w:hAnsi="Open Sans"/>
           <w:b w:val="false"/>
           <w:bCs w:val="false"/>
-          <w:i w:val="false"/>
           <w:i w:val="false"/>
           <w:iCs w:val="false"/>
           <w:sz w:val="22"/>
@@ -408,10 +404,9 @@
       <w:pPr>
         <w:pStyle w:val="Heading3"/>
         <w:bidi w:val="0"/>
-        <w:ind w:hanging="0" w:left="72"/>
-        <w:jc w:val="left"/>
-        <w:rPr>
-          <w:i w:val="false"/>
+        <w:ind w:hanging="0" w:start="72"/>
+        <w:jc w:val="start"/>
+        <w:rPr>
           <w:i w:val="false"/>
           <w:iCs w:val="false"/>
         </w:rPr>
@@ -429,8 +424,8 @@
         <w:pStyle w:val="Heading5"/>
         <w:bidi w:val="0"/>
         <w:spacing w:before="0" w:after="58"/>
-        <w:ind w:hanging="0" w:left="72"/>
-        <w:jc w:val="left"/>
+        <w:ind w:hanging="0" w:start="72"/>
+        <w:jc w:val="start"/>
         <w:rPr/>
       </w:pPr>
       <w:r>
@@ -469,7 +464,7 @@
       <w:pPr>
         <w:pStyle w:val="Education"/>
         <w:bidi w:val="0"/>
-        <w:jc w:val="left"/>
+        <w:jc w:val="start"/>
         <w:rPr/>
       </w:pPr>
       <w:r>
@@ -482,7 +477,7 @@
         <w:pStyle w:val="Education"/>
         <w:bidi w:val="0"/>
         <w:spacing w:before="0" w:after="86"/>
-        <w:jc w:val="left"/>
+        <w:jc w:val="start"/>
         <w:rPr/>
       </w:pPr>
       <w:r>
@@ -495,7 +490,7 @@
         <w:pStyle w:val="Education"/>
         <w:bidi w:val="0"/>
         <w:spacing w:before="0" w:after="58"/>
-        <w:jc w:val="left"/>
+        <w:jc w:val="start"/>
         <w:rPr/>
       </w:pPr>
       <w:r>
@@ -507,7 +502,7 @@
       <w:pPr>
         <w:pStyle w:val="Education"/>
         <w:bidi w:val="0"/>
-        <w:jc w:val="left"/>
+        <w:jc w:val="start"/>
         <w:rPr/>
       </w:pPr>
       <w:r>
@@ -519,10 +514,9 @@
       <w:pPr>
         <w:pStyle w:val="Heading3"/>
         <w:bidi w:val="0"/>
-        <w:ind w:hanging="0" w:left="72"/>
-        <w:jc w:val="left"/>
-        <w:rPr>
-          <w:i w:val="false"/>
+        <w:ind w:hanging="0" w:start="72"/>
+        <w:jc w:val="start"/>
+        <w:rPr>
           <w:i w:val="false"/>
           <w:iCs w:val="false"/>
         </w:rPr>
@@ -539,7 +533,7 @@
       <w:pPr>
         <w:pStyle w:val="Normal"/>
         <w:bidi w:val="0"/>
-        <w:jc w:val="left"/>
+        <w:jc w:val="start"/>
         <w:rPr/>
       </w:pPr>
       <w:r>
@@ -551,7 +545,7 @@
       <w:pPr>
         <w:pStyle w:val="Normal"/>
         <w:bidi w:val="0"/>
-        <w:jc w:val="left"/>
+        <w:jc w:val="start"/>
         <w:rPr/>
       </w:pPr>
       <w:r>
@@ -563,7 +557,7 @@
       <w:pPr>
         <w:pStyle w:val="Normal"/>
         <w:bidi w:val="0"/>
-        <w:jc w:val="left"/>
+        <w:jc w:val="start"/>
         <w:rPr/>
       </w:pPr>
       <w:r>
@@ -575,7 +569,7 @@
       <w:pPr>
         <w:pStyle w:val="Normal"/>
         <w:bidi w:val="0"/>
-        <w:jc w:val="left"/>
+        <w:jc w:val="start"/>
         <w:rPr/>
       </w:pPr>
       <w:r>
@@ -587,7 +581,7 @@
       <w:pPr>
         <w:pStyle w:val="Normal"/>
         <w:bidi w:val="0"/>
-        <w:jc w:val="left"/>
+        <w:jc w:val="start"/>
         <w:rPr/>
       </w:pPr>
       <w:r>
@@ -600,8 +594,8 @@
         <w:pStyle w:val="Normal"/>
         <w:bidi w:val="0"/>
         <w:spacing w:before="0" w:after="0"/>
-        <w:ind w:hanging="0" w:left="72" w:right="0"/>
-        <w:jc w:val="left"/>
+        <w:ind w:hanging="0" w:start="72" w:end="0"/>
+        <w:jc w:val="start"/>
         <w:rPr/>
       </w:pPr>
       <w:r>
@@ -617,10 +611,9 @@
           <w:numId w:val="0"/>
         </w:numPr>
         <w:bidi w:val="0"/>
-        <w:ind w:hanging="0" w:left="0"/>
-        <w:jc w:val="left"/>
-        <w:rPr>
-          <w:i w:val="false"/>
+        <w:ind w:hanging="0" w:start="0"/>
+        <w:jc w:val="start"/>
+        <w:rPr>
           <w:i w:val="false"/>
           <w:iCs w:val="false"/>
         </w:rPr>
@@ -641,8 +634,8 @@
           <w:numId w:val="0"/>
         </w:numPr>
         <w:bidi w:val="0"/>
-        <w:ind w:hanging="0" w:left="0" w:right="0"/>
-        <w:jc w:val="left"/>
+        <w:ind w:hanging="0" w:start="0" w:end="0"/>
+        <w:jc w:val="start"/>
         <w:rPr/>
       </w:pPr>
       <w:r>
@@ -662,8 +655,8 @@
           <w:numId w:val="0"/>
         </w:numPr>
         <w:bidi w:val="0"/>
-        <w:ind w:hanging="0" w:left="0" w:right="0"/>
-        <w:jc w:val="left"/>
+        <w:ind w:hanging="0" w:start="0" w:end="0"/>
+        <w:jc w:val="start"/>
         <w:rPr/>
       </w:pPr>
       <w:r>
@@ -683,8 +676,8 @@
           <w:numId w:val="0"/>
         </w:numPr>
         <w:bidi w:val="0"/>
-        <w:ind w:hanging="0" w:left="0" w:right="0"/>
-        <w:jc w:val="left"/>
+        <w:ind w:hanging="0" w:start="0" w:end="0"/>
+        <w:jc w:val="start"/>
         <w:rPr/>
       </w:pPr>
       <w:r>
@@ -700,7 +693,7 @@
       <w:pPr>
         <w:pStyle w:val="Normal"/>
         <w:bidi w:val="0"/>
-        <w:jc w:val="left"/>
+        <w:jc w:val="start"/>
         <w:rPr/>
       </w:pPr>
       <w:r>
@@ -712,7 +705,7 @@
       <w:pPr>
         <w:pStyle w:val="Normal"/>
         <w:bidi w:val="0"/>
-        <w:jc w:val="left"/>
+        <w:jc w:val="start"/>
         <w:rPr>
           <w:sz w:val="12"/>
           <w:szCs w:val="12"/>
@@ -729,9 +722,8 @@
       <w:pPr>
         <w:pStyle w:val="sidenote"/>
         <w:bidi w:val="0"/>
-        <w:jc w:val="left"/>
-        <w:rPr>
-          <w:i/>
+        <w:jc w:val="start"/>
+        <w:rPr>
           <w:i/>
           <w:iCs/>
         </w:rPr>
@@ -749,13 +741,12 @@
         <w:pStyle w:val="Normal"/>
         <w:bidi w:val="0"/>
         <w:spacing w:before="0" w:after="0"/>
-        <w:ind w:hanging="0" w:left="72" w:right="0"/>
-        <w:jc w:val="left"/>
+        <w:ind w:hanging="0" w:start="72" w:end="0"/>
+        <w:jc w:val="start"/>
         <w:rPr>
           <w:rFonts w:ascii="Open Sans" w:hAnsi="Open Sans"/>
           <w:b w:val="false"/>
           <w:bCs w:val="false"/>
-          <w:i w:val="false"/>
           <w:i w:val="false"/>
           <w:iCs w:val="false"/>
         </w:rPr>
@@ -787,10 +778,9 @@
         <w:pStyle w:val="Normal"/>
         <w:bidi w:val="0"/>
         <w:spacing w:before="0" w:after="0"/>
-        <w:ind w:hanging="0" w:left="72" w:right="0"/>
-        <w:jc w:val="left"/>
-        <w:rPr>
-          <w:i w:val="false"/>
+        <w:ind w:hanging="0" w:start="72" w:end="0"/>
+        <w:jc w:val="start"/>
+        <w:rPr>
           <w:i w:val="false"/>
           <w:iCs w:val="false"/>
         </w:rPr>
@@ -808,7 +798,7 @@
       <w:pPr>
         <w:pStyle w:val="sidenote"/>
         <w:bidi w:val="0"/>
-        <w:jc w:val="left"/>
+        <w:jc w:val="start"/>
         <w:rPr>
           <w:sz w:val="12"/>
           <w:szCs w:val="12"/>
@@ -826,8 +816,8 @@
       <w:pPr>
         <w:pStyle w:val="Heading3"/>
         <w:bidi w:val="0"/>
-        <w:ind w:hanging="0" w:left="72"/>
-        <w:jc w:val="left"/>
+        <w:ind w:hanging="0" w:start="72"/>
+        <w:jc w:val="start"/>
         <w:rPr/>
       </w:pPr>
       <w:r>
@@ -842,8 +832,8 @@
       <w:pPr>
         <w:pStyle w:val="Heading5"/>
         <w:bidi w:val="0"/>
-        <w:ind w:hanging="0" w:left="72"/>
-        <w:jc w:val="left"/>
+        <w:ind w:hanging="0" w:start="72"/>
+        <w:jc w:val="start"/>
         <w:rPr/>
       </w:pPr>
       <w:r>
@@ -855,7 +845,7 @@
       <w:pPr>
         <w:pStyle w:val="Normal"/>
         <w:bidi w:val="0"/>
-        <w:jc w:val="left"/>
+        <w:jc w:val="start"/>
         <w:rPr/>
       </w:pPr>
       <w:r>
@@ -878,7 +868,7 @@
           <w:numId w:val="4"/>
         </w:numPr>
         <w:bidi w:val="0"/>
-        <w:jc w:val="left"/>
+        <w:jc w:val="start"/>
         <w:rPr/>
       </w:pPr>
       <w:r>
@@ -894,7 +884,7 @@
           <w:numId w:val="4"/>
         </w:numPr>
         <w:bidi w:val="0"/>
-        <w:jc w:val="left"/>
+        <w:jc w:val="start"/>
         <w:rPr/>
       </w:pPr>
       <w:r>
@@ -910,7 +900,7 @@
           <w:numId w:val="4"/>
         </w:numPr>
         <w:bidi w:val="0"/>
-        <w:jc w:val="left"/>
+        <w:jc w:val="start"/>
         <w:rPr/>
       </w:pPr>
       <w:r>
@@ -926,7 +916,7 @@
           <w:numId w:val="4"/>
         </w:numPr>
         <w:bidi w:val="0"/>
-        <w:jc w:val="left"/>
+        <w:jc w:val="start"/>
         <w:rPr/>
       </w:pPr>
       <w:r>
@@ -942,7 +932,7 @@
           <w:numId w:val="4"/>
         </w:numPr>
         <w:bidi w:val="0"/>
-        <w:jc w:val="left"/>
+        <w:jc w:val="start"/>
         <w:rPr/>
       </w:pPr>
       <w:r>
@@ -962,7 +952,7 @@
           <w:numId w:val="4"/>
         </w:numPr>
         <w:bidi w:val="0"/>
-        <w:jc w:val="left"/>
+        <w:jc w:val="start"/>
         <w:rPr/>
       </w:pPr>
       <w:r>
@@ -978,7 +968,7 @@
           <w:numId w:val="4"/>
         </w:numPr>
         <w:bidi w:val="0"/>
-        <w:jc w:val="left"/>
+        <w:jc w:val="start"/>
         <w:rPr/>
       </w:pPr>
       <w:r>
@@ -1002,7 +992,7 @@
           <w:numId w:val="4"/>
         </w:numPr>
         <w:bidi w:val="0"/>
-        <w:jc w:val="left"/>
+        <w:jc w:val="start"/>
         <w:rPr/>
       </w:pPr>
       <w:r>
@@ -1018,8 +1008,8 @@
       <w:pPr>
         <w:pStyle w:val="Heading5"/>
         <w:bidi w:val="0"/>
-        <w:ind w:hanging="0" w:left="72"/>
-        <w:jc w:val="left"/>
+        <w:ind w:hanging="0" w:start="72"/>
+        <w:jc w:val="start"/>
         <w:rPr/>
       </w:pPr>
       <w:r>
@@ -1031,7 +1021,7 @@
       <w:pPr>
         <w:pStyle w:val="Normal"/>
         <w:bidi w:val="0"/>
-        <w:jc w:val="left"/>
+        <w:jc w:val="start"/>
         <w:rPr/>
       </w:pPr>
       <w:r>
@@ -1062,11 +1052,10 @@
           <w:numId w:val="5"/>
         </w:numPr>
         <w:bidi w:val="0"/>
-        <w:jc w:val="left"/>
-        <w:rPr>
-          <w:b w:val="false"/>
-          <w:bCs w:val="false"/>
-          <w:i w:val="false"/>
+        <w:jc w:val="start"/>
+        <w:rPr>
+          <w:b w:val="false"/>
+          <w:bCs w:val="false"/>
           <w:i w:val="false"/>
           <w:iCs w:val="false"/>
         </w:rPr>
@@ -1098,11 +1087,10 @@
           <w:numId w:val="5"/>
         </w:numPr>
         <w:bidi w:val="0"/>
-        <w:jc w:val="left"/>
-        <w:rPr>
-          <w:b w:val="false"/>
-          <w:bCs w:val="false"/>
-          <w:i w:val="false"/>
+        <w:jc w:val="start"/>
+        <w:rPr>
+          <w:b w:val="false"/>
+          <w:bCs w:val="false"/>
           <w:i w:val="false"/>
           <w:iCs w:val="false"/>
         </w:rPr>
@@ -1125,7 +1113,7 @@
           <w:numId w:val="5"/>
         </w:numPr>
         <w:bidi w:val="0"/>
-        <w:jc w:val="left"/>
+        <w:jc w:val="start"/>
         <w:rPr/>
       </w:pPr>
       <w:r>
@@ -1141,11 +1129,10 @@
           <w:numId w:val="5"/>
         </w:numPr>
         <w:bidi w:val="0"/>
-        <w:jc w:val="left"/>
-        <w:rPr>
-          <w:b w:val="false"/>
-          <w:bCs w:val="false"/>
-          <w:i w:val="false"/>
+        <w:jc w:val="start"/>
+        <w:rPr>
+          <w:b w:val="false"/>
+          <w:bCs w:val="false"/>
           <w:i w:val="false"/>
           <w:iCs w:val="false"/>
         </w:rPr>
@@ -1168,11 +1155,10 @@
           <w:numId w:val="5"/>
         </w:numPr>
         <w:bidi w:val="0"/>
-        <w:jc w:val="left"/>
-        <w:rPr>
-          <w:b w:val="false"/>
-          <w:bCs w:val="false"/>
-          <w:i w:val="false"/>
+        <w:jc w:val="start"/>
+        <w:rPr>
+          <w:b w:val="false"/>
+          <w:bCs w:val="false"/>
           <w:i w:val="false"/>
           <w:iCs w:val="false"/>
         </w:rPr>
@@ -1195,11 +1181,10 @@
           <w:numId w:val="5"/>
         </w:numPr>
         <w:bidi w:val="0"/>
-        <w:jc w:val="left"/>
-        <w:rPr>
-          <w:b w:val="false"/>
-          <w:bCs w:val="false"/>
-          <w:i w:val="false"/>
+        <w:jc w:val="start"/>
+        <w:rPr>
+          <w:b w:val="false"/>
+          <w:bCs w:val="false"/>
           <w:i w:val="false"/>
           <w:iCs w:val="false"/>
         </w:rPr>
@@ -1222,7 +1207,7 @@
           <w:numId w:val="5"/>
         </w:numPr>
         <w:bidi w:val="0"/>
-        <w:jc w:val="left"/>
+        <w:jc w:val="start"/>
         <w:rPr/>
       </w:pPr>
       <w:r>
@@ -1252,7 +1237,7 @@
           <w:numId w:val="5"/>
         </w:numPr>
         <w:bidi w:val="0"/>
-        <w:jc w:val="left"/>
+        <w:jc w:val="start"/>
         <w:rPr>
           <w:b w:val="false"/>
           <w:bCs w:val="false"/>
@@ -1274,8 +1259,8 @@
           <w:numId w:val="0"/>
         </w:numPr>
         <w:bidi w:val="0"/>
-        <w:ind w:hanging="0" w:left="0" w:right="0"/>
-        <w:jc w:val="left"/>
+        <w:ind w:hanging="0" w:start="0" w:end="0"/>
+        <w:jc w:val="start"/>
         <w:rPr/>
       </w:pPr>
       <w:r>
@@ -1291,8 +1276,8 @@
           <w:numId w:val="0"/>
         </w:numPr>
         <w:bidi w:val="0"/>
-        <w:ind w:hanging="0" w:left="0" w:right="0"/>
-        <w:jc w:val="left"/>
+        <w:ind w:hanging="0" w:start="0" w:end="0"/>
+        <w:jc w:val="start"/>
         <w:rPr/>
       </w:pPr>
       <w:r>
@@ -1321,7 +1306,7 @@
           <w:numId w:val="5"/>
         </w:numPr>
         <w:bidi w:val="0"/>
-        <w:jc w:val="left"/>
+        <w:jc w:val="start"/>
         <w:rPr/>
       </w:pPr>
       <w:r>
@@ -1337,7 +1322,7 @@
           <w:numId w:val="5"/>
         </w:numPr>
         <w:bidi w:val="0"/>
-        <w:jc w:val="left"/>
+        <w:jc w:val="start"/>
         <w:rPr/>
       </w:pPr>
       <w:r>
@@ -1353,7 +1338,7 @@
           <w:numId w:val="5"/>
         </w:numPr>
         <w:bidi w:val="0"/>
-        <w:jc w:val="left"/>
+        <w:jc w:val="start"/>
         <w:rPr/>
       </w:pPr>
       <w:r>
@@ -1380,8 +1365,8 @@
       <w:pPr>
         <w:pStyle w:val="Heading5"/>
         <w:bidi w:val="0"/>
-        <w:ind w:hanging="0" w:left="72"/>
-        <w:jc w:val="left"/>
+        <w:ind w:hanging="0" w:start="72"/>
+        <w:jc w:val="start"/>
         <w:rPr/>
       </w:pPr>
       <w:r>
@@ -1394,8 +1379,8 @@
         <w:pStyle w:val="Normal"/>
         <w:bidi w:val="0"/>
         <w:spacing w:before="0" w:after="0"/>
-        <w:ind w:hanging="0" w:left="72" w:right="0"/>
-        <w:jc w:val="left"/>
+        <w:ind w:hanging="0" w:start="72" w:end="0"/>
+        <w:jc w:val="start"/>
         <w:rPr/>
       </w:pPr>
       <w:r>
@@ -1426,7 +1411,7 @@
           <w:numId w:val="6"/>
         </w:numPr>
         <w:bidi w:val="0"/>
-        <w:jc w:val="left"/>
+        <w:jc w:val="start"/>
         <w:rPr>
           <w:b w:val="false"/>
           <w:bCs w:val="false"/>
@@ -1459,17 +1444,25 @@
           <w:sz w:val="20"/>
           <w:szCs w:val="20"/>
         </w:rPr>
-        <w:t xml:space="preserve"> 8 web back-end wit</w:t>
-      </w:r>
-      <w:r>
+        <w:t xml:space="preserve"> 8 web back-end with Oracle SQL</w:t>
+      </w:r>
+    </w:p>
+    <w:p>
+      <w:pPr>
+        <w:pStyle w:val="Normal"/>
+        <w:numPr>
+          <w:ilvl w:val="0"/>
+          <w:numId w:val="6"/>
+        </w:numPr>
+        <w:bidi w:val="0"/>
+        <w:jc w:val="start"/>
         <w:rPr>
           <w:b w:val="false"/>
           <w:bCs w:val="false"/>
           <w:sz w:val="20"/>
           <w:szCs w:val="20"/>
         </w:rPr>
-        <w:t>f</w:t>
-      </w:r>
+      </w:pPr>
       <w:r>
         <w:rPr>
           <w:b w:val="false"/>
@@ -1477,7 +1470,7 @@
           <w:sz w:val="20"/>
           <w:szCs w:val="20"/>
         </w:rPr>
-        <w:t>h Oracle SQL</w:t>
+        <w:t>Built numerous meta-programming utilities to increase developer productivity (utilizing Java Reflection API)</w:t>
       </w:r>
     </w:p>
     <w:p>
@@ -1488,7 +1481,7 @@
           <w:numId w:val="6"/>
         </w:numPr>
         <w:bidi w:val="0"/>
-        <w:jc w:val="left"/>
+        <w:jc w:val="start"/>
         <w:rPr>
           <w:b w:val="false"/>
           <w:bCs w:val="false"/>
@@ -1503,7 +1496,7 @@
           <w:sz w:val="20"/>
           <w:szCs w:val="20"/>
         </w:rPr>
-        <w:t>Built numerous meta-programming utilities to increase developer productivity (utilizing Java Reflection API)</w:t>
+        <w:t>Implemented OOP abstractions for many common operations</w:t>
       </w:r>
     </w:p>
     <w:p>
@@ -1514,7 +1507,7 @@
           <w:numId w:val="6"/>
         </w:numPr>
         <w:bidi w:val="0"/>
-        <w:jc w:val="left"/>
+        <w:jc w:val="start"/>
         <w:rPr>
           <w:b w:val="false"/>
           <w:bCs w:val="false"/>
@@ -1529,18 +1522,18 @@
           <w:sz w:val="20"/>
           <w:szCs w:val="20"/>
         </w:rPr>
-        <w:t>Implemented OOP abstractions for many common operations</w:t>
-      </w:r>
-    </w:p>
-    <w:p>
-      <w:pPr>
-        <w:pStyle w:val="Normal"/>
-        <w:numPr>
-          <w:ilvl w:val="0"/>
+        <w:t>Spearheaded Linux Project Management KVM server</w:t>
+      </w:r>
+    </w:p>
+    <w:p>
+      <w:pPr>
+        <w:pStyle w:val="Normal"/>
+        <w:numPr>
+          <w:ilvl w:val="1"/>
           <w:numId w:val="6"/>
         </w:numPr>
         <w:bidi w:val="0"/>
-        <w:jc w:val="left"/>
+        <w:jc w:val="start"/>
         <w:rPr>
           <w:b w:val="false"/>
           <w:bCs w:val="false"/>
@@ -1555,18 +1548,18 @@
           <w:sz w:val="20"/>
           <w:szCs w:val="20"/>
         </w:rPr>
-        <w:t>Spearheaded Linux Project Management KVM server</w:t>
-      </w:r>
-    </w:p>
-    <w:p>
-      <w:pPr>
-        <w:pStyle w:val="Normal"/>
-        <w:numPr>
-          <w:ilvl w:val="1"/>
+        <w:t>Ubuntu, Redmine, Jenkins, Gitlab, libvirt, SonarQube, Mattermost</w:t>
+      </w:r>
+    </w:p>
+    <w:p>
+      <w:pPr>
+        <w:pStyle w:val="Normal"/>
+        <w:numPr>
+          <w:ilvl w:val="0"/>
           <w:numId w:val="6"/>
         </w:numPr>
         <w:bidi w:val="0"/>
-        <w:jc w:val="left"/>
+        <w:jc w:val="start"/>
         <w:rPr>
           <w:b w:val="false"/>
           <w:bCs w:val="false"/>
@@ -1581,7 +1574,7 @@
           <w:sz w:val="20"/>
           <w:szCs w:val="20"/>
         </w:rPr>
-        <w:t>Ubuntu, Redmine, Jenkins, Gitlab, libvirt, SonarQube, Mattermost</w:t>
+        <w:t>Exemplified Functional Programming in Java 8</w:t>
       </w:r>
     </w:p>
     <w:p>
@@ -1592,7 +1585,7 @@
           <w:numId w:val="6"/>
         </w:numPr>
         <w:bidi w:val="0"/>
-        <w:jc w:val="left"/>
+        <w:jc w:val="start"/>
         <w:rPr>
           <w:b w:val="false"/>
           <w:bCs w:val="false"/>
@@ -1607,7 +1600,7 @@
           <w:sz w:val="20"/>
           <w:szCs w:val="20"/>
         </w:rPr>
-        <w:t>Exemplified Functional Programming in Java 8</w:t>
+        <w:t>Contributed to homegrown SQL query builder library</w:t>
       </w:r>
     </w:p>
     <w:p>
@@ -1618,7 +1611,7 @@
           <w:numId w:val="6"/>
         </w:numPr>
         <w:bidi w:val="0"/>
-        <w:jc w:val="left"/>
+        <w:jc w:val="start"/>
         <w:rPr>
           <w:b w:val="false"/>
           <w:bCs w:val="false"/>
@@ -1633,7 +1626,7 @@
           <w:sz w:val="20"/>
           <w:szCs w:val="20"/>
         </w:rPr>
-        <w:t>Contributed to homegrown SQL query builder library</w:t>
+        <w:t>Converted legacy Delphi codebase faithfully</w:t>
       </w:r>
     </w:p>
     <w:p>
@@ -1644,7 +1637,7 @@
           <w:numId w:val="6"/>
         </w:numPr>
         <w:bidi w:val="0"/>
-        <w:jc w:val="left"/>
+        <w:jc w:val="start"/>
         <w:rPr>
           <w:b w:val="false"/>
           <w:bCs w:val="false"/>
@@ -1659,25 +1652,17 @@
           <w:sz w:val="20"/>
           <w:szCs w:val="20"/>
         </w:rPr>
-        <w:t>Converted legacy Delphi codebase faithfully</w:t>
-      </w:r>
-    </w:p>
-    <w:p>
-      <w:pPr>
-        <w:pStyle w:val="Normal"/>
-        <w:numPr>
-          <w:ilvl w:val="0"/>
-          <w:numId w:val="6"/>
-        </w:numPr>
-        <w:bidi w:val="0"/>
-        <w:jc w:val="left"/>
+        <w:t xml:space="preserve">Consistently reduced code volume by </w:t>
+      </w:r>
+      <w:r>
         <w:rPr>
           <w:b w:val="false"/>
           <w:bCs w:val="false"/>
           <w:sz w:val="20"/>
           <w:szCs w:val="20"/>
         </w:rPr>
-      </w:pPr>
+        <w:t xml:space="preserve">a </w:t>
+      </w:r>
       <w:r>
         <w:rPr>
           <w:b w:val="false"/>
@@ -1685,24 +1670,6 @@
           <w:sz w:val="20"/>
           <w:szCs w:val="20"/>
         </w:rPr>
-        <w:t xml:space="preserve">Consistently reduced code volume by </w:t>
-      </w:r>
-      <w:r>
-        <w:rPr>
-          <w:b w:val="false"/>
-          <w:bCs w:val="false"/>
-          <w:sz w:val="20"/>
-          <w:szCs w:val="20"/>
-        </w:rPr>
-        <w:t xml:space="preserve">a </w:t>
-      </w:r>
-      <w:r>
-        <w:rPr>
-          <w:b w:val="false"/>
-          <w:bCs w:val="false"/>
-          <w:sz w:val="20"/>
-          <w:szCs w:val="20"/>
-        </w:rPr>
         <w:t>factor of 3</w:t>
       </w:r>
     </w:p>
@@ -1714,10 +1681,9 @@
           <w:numId w:val="0"/>
         </w:numPr>
         <w:bidi w:val="0"/>
-        <w:ind w:hanging="0" w:left="0"/>
-        <w:jc w:val="left"/>
-        <w:rPr>
-          <w:i w:val="false"/>
+        <w:ind w:hanging="0" w:start="0"/>
+        <w:jc w:val="start"/>
+        <w:rPr>
           <w:i w:val="false"/>
           <w:iCs w:val="false"/>
         </w:rPr>
@@ -1734,7 +1700,7 @@
       <w:pPr>
         <w:pStyle w:val="Normal"/>
         <w:bidi w:val="0"/>
-        <w:jc w:val="left"/>
+        <w:jc w:val="start"/>
         <w:rPr/>
       </w:pPr>
       <w:r>
@@ -1746,7 +1712,7 @@
       <w:pPr>
         <w:pStyle w:val="Normal"/>
         <w:bidi w:val="0"/>
-        <w:jc w:val="left"/>
+        <w:jc w:val="start"/>
         <w:rPr>
           <w:sz w:val="12"/>
           <w:szCs w:val="12"/>
@@ -1763,7 +1729,7 @@
       <w:pPr>
         <w:pStyle w:val="Normal"/>
         <w:bidi w:val="0"/>
-        <w:jc w:val="left"/>
+        <w:jc w:val="start"/>
         <w:rPr/>
       </w:pPr>
       <w:r>
@@ -1806,12 +1772,12 @@
       <w:numFmt w:val="none"/>
       <w:suff w:val="nothing"/>
       <w:lvlText w:val="%1"/>
-      <w:lvlJc w:val="left"/>
+      <w:lvlJc w:val="start"/>
       <w:pPr>
         <w:tabs>
           <w:tab w:val="num" w:pos="0"/>
         </w:tabs>
-        <w:ind w:left="0" w:hanging="0"/>
+        <w:ind w:start="0" w:hanging="0"/>
       </w:pPr>
     </w:lvl>
     <w:lvl w:ilvl="1">
@@ -1819,68 +1785,68 @@
       <w:numFmt w:val="none"/>
       <w:suff w:val="nothing"/>
       <w:lvlText w:val="%2"/>
-      <w:lvlJc w:val="left"/>
+      <w:lvlJc w:val="start"/>
       <w:pPr>
         <w:tabs>
           <w:tab w:val="num" w:pos="0"/>
         </w:tabs>
-        <w:ind w:left="0" w:hanging="0"/>
+        <w:ind w:start="0" w:hanging="0"/>
       </w:pPr>
     </w:lvl>
     <w:lvl w:ilvl="2">
       <w:start w:val="1"/>
+      <w:numFmt w:val="none"/>
       <w:pStyle w:val="Heading3"/>
-      <w:numFmt w:val="none"/>
       <w:suff w:val="nothing"/>
       <w:lvlText w:val="%3"/>
-      <w:lvlJc w:val="left"/>
+      <w:lvlJc w:val="start"/>
       <w:pPr>
         <w:tabs>
           <w:tab w:val="num" w:pos="0"/>
         </w:tabs>
-        <w:ind w:left="0" w:hanging="0"/>
+        <w:ind w:start="0" w:hanging="0"/>
       </w:pPr>
     </w:lvl>
     <w:lvl w:ilvl="3">
       <w:start w:val="1"/>
+      <w:numFmt w:val="none"/>
       <w:pStyle w:val="Heading4"/>
-      <w:numFmt w:val="none"/>
       <w:suff w:val="nothing"/>
       <w:lvlText w:val="%4"/>
-      <w:lvlJc w:val="left"/>
+      <w:lvlJc w:val="start"/>
       <w:pPr>
         <w:tabs>
           <w:tab w:val="num" w:pos="0"/>
         </w:tabs>
-        <w:ind w:left="0" w:hanging="0"/>
+        <w:ind w:start="0" w:hanging="0"/>
       </w:pPr>
     </w:lvl>
     <w:lvl w:ilvl="4">
       <w:start w:val="1"/>
+      <w:numFmt w:val="none"/>
       <w:pStyle w:val="Heading5"/>
-      <w:numFmt w:val="none"/>
       <w:suff w:val="nothing"/>
       <w:lvlText w:val="%5"/>
-      <w:lvlJc w:val="left"/>
+      <w:lvlJc w:val="start"/>
       <w:pPr>
         <w:tabs>
           <w:tab w:val="num" w:pos="0"/>
         </w:tabs>
-        <w:ind w:left="0" w:hanging="0"/>
+        <w:ind w:start="0" w:hanging="0"/>
       </w:pPr>
     </w:lvl>
     <w:lvl w:ilvl="5">
       <w:start w:val="1"/>
+      <w:numFmt w:val="none"/>
       <w:pStyle w:val="Heading6"/>
-      <w:numFmt w:val="none"/>
       <w:suff w:val="nothing"/>
       <w:lvlText w:val="%6"/>
-      <w:lvlJc w:val="left"/>
+      <w:lvlJc w:val="start"/>
       <w:pPr>
         <w:tabs>
           <w:tab w:val="num" w:pos="0"/>
         </w:tabs>
-        <w:ind w:left="0" w:hanging="0"/>
+        <w:ind w:start="0" w:hanging="0"/>
       </w:pPr>
     </w:lvl>
     <w:lvl w:ilvl="6">
@@ -1888,12 +1854,12 @@
       <w:numFmt w:val="none"/>
       <w:suff w:val="nothing"/>
       <w:lvlText w:val="%7"/>
-      <w:lvlJc w:val="left"/>
+      <w:lvlJc w:val="start"/>
       <w:pPr>
         <w:tabs>
           <w:tab w:val="num" w:pos="0"/>
         </w:tabs>
-        <w:ind w:left="0" w:hanging="0"/>
+        <w:ind w:start="0" w:hanging="0"/>
       </w:pPr>
     </w:lvl>
     <w:lvl w:ilvl="7">
@@ -1901,12 +1867,12 @@
       <w:numFmt w:val="none"/>
       <w:suff w:val="nothing"/>
       <w:lvlText w:val="%8"/>
-      <w:lvlJc w:val="left"/>
+      <w:lvlJc w:val="start"/>
       <w:pPr>
         <w:tabs>
           <w:tab w:val="num" w:pos="0"/>
         </w:tabs>
-        <w:ind w:left="0" w:hanging="0"/>
+        <w:ind w:start="0" w:hanging="0"/>
       </w:pPr>
     </w:lvl>
     <w:lvl w:ilvl="8">
@@ -1914,12 +1880,12 @@
       <w:numFmt w:val="none"/>
       <w:suff w:val="nothing"/>
       <w:lvlText w:val="%9"/>
-      <w:lvlJc w:val="left"/>
+      <w:lvlJc w:val="start"/>
       <w:pPr>
         <w:tabs>
           <w:tab w:val="num" w:pos="0"/>
         </w:tabs>
-        <w:ind w:left="0" w:hanging="0"/>
+        <w:ind w:start="0" w:hanging="0"/>
       </w:pPr>
     </w:lvl>
   </w:abstractNum>
@@ -1928,108 +1894,108 @@
       <w:start w:val="1"/>
       <w:numFmt w:val="decimal"/>
       <w:lvlText w:val="%1."/>
-      <w:lvlJc w:val="left"/>
+      <w:lvlJc w:val="start"/>
       <w:pPr>
         <w:tabs>
           <w:tab w:val="num" w:pos="490"/>
         </w:tabs>
-        <w:ind w:left="490" w:hanging="245"/>
+        <w:ind w:start="490" w:hanging="245"/>
       </w:pPr>
     </w:lvl>
     <w:lvl w:ilvl="1">
       <w:start w:val="1"/>
       <w:numFmt w:val="decimal"/>
       <w:lvlText w:val="%2."/>
-      <w:lvlJc w:val="left"/>
+      <w:lvlJc w:val="start"/>
       <w:pPr>
         <w:tabs>
           <w:tab w:val="num" w:pos="490"/>
         </w:tabs>
-        <w:ind w:left="490" w:hanging="245"/>
+        <w:ind w:start="490" w:hanging="245"/>
       </w:pPr>
     </w:lvl>
     <w:lvl w:ilvl="2">
       <w:start w:val="1"/>
       <w:numFmt w:val="decimal"/>
       <w:lvlText w:val="%3."/>
-      <w:lvlJc w:val="left"/>
+      <w:lvlJc w:val="start"/>
       <w:pPr>
         <w:tabs>
           <w:tab w:val="num" w:pos="1440"/>
         </w:tabs>
-        <w:ind w:left="1440" w:hanging="360"/>
+        <w:ind w:start="1440" w:hanging="360"/>
       </w:pPr>
     </w:lvl>
     <w:lvl w:ilvl="3">
       <w:start w:val="1"/>
       <w:numFmt w:val="decimal"/>
       <w:lvlText w:val="%4."/>
-      <w:lvlJc w:val="left"/>
+      <w:lvlJc w:val="start"/>
       <w:pPr>
         <w:tabs>
           <w:tab w:val="num" w:pos="1800"/>
         </w:tabs>
-        <w:ind w:left="1800" w:hanging="360"/>
+        <w:ind w:start="1800" w:hanging="360"/>
       </w:pPr>
     </w:lvl>
     <w:lvl w:ilvl="4">
       <w:start w:val="1"/>
       <w:numFmt w:val="decimal"/>
       <w:lvlText w:val="%5."/>
-      <w:lvlJc w:val="left"/>
+      <w:lvlJc w:val="start"/>
       <w:pPr>
         <w:tabs>
           <w:tab w:val="num" w:pos="2160"/>
         </w:tabs>
-        <w:ind w:left="2160" w:hanging="360"/>
+        <w:ind w:start="2160" w:hanging="360"/>
       </w:pPr>
     </w:lvl>
     <w:lvl w:ilvl="5">
       <w:start w:val="1"/>
       <w:numFmt w:val="decimal"/>
       <w:lvlText w:val="%6."/>
-      <w:lvlJc w:val="left"/>
+      <w:lvlJc w:val="start"/>
       <w:pPr>
         <w:tabs>
           <w:tab w:val="num" w:pos="2520"/>
         </w:tabs>
-        <w:ind w:left="2520" w:hanging="360"/>
+        <w:ind w:start="2520" w:hanging="360"/>
       </w:pPr>
     </w:lvl>
     <w:lvl w:ilvl="6">
       <w:start w:val="1"/>
       <w:numFmt w:val="decimal"/>
       <w:lvlText w:val="%7."/>
-      <w:lvlJc w:val="left"/>
+      <w:lvlJc w:val="start"/>
       <w:pPr>
         <w:tabs>
           <w:tab w:val="num" w:pos="2880"/>
         </w:tabs>
-        <w:ind w:left="2880" w:hanging="360"/>
+        <w:ind w:start="2880" w:hanging="360"/>
       </w:pPr>
     </w:lvl>
     <w:lvl w:ilvl="7">
       <w:start w:val="1"/>
       <w:numFmt w:val="decimal"/>
       <w:lvlText w:val="%8."/>
-      <w:lvlJc w:val="left"/>
+      <w:lvlJc w:val="start"/>
       <w:pPr>
         <w:tabs>
           <w:tab w:val="num" w:pos="3240"/>
         </w:tabs>
-        <w:ind w:left="3240" w:hanging="360"/>
+        <w:ind w:start="3240" w:hanging="360"/>
       </w:pPr>
     </w:lvl>
     <w:lvl w:ilvl="8">
       <w:start w:val="1"/>
       <w:numFmt w:val="decimal"/>
       <w:lvlText w:val="%9."/>
-      <w:lvlJc w:val="left"/>
+      <w:lvlJc w:val="start"/>
       <w:pPr>
         <w:tabs>
           <w:tab w:val="num" w:pos="3600"/>
         </w:tabs>
-        <w:ind w:left="3600" w:hanging="360"/>
+        <w:ind w:start="3600" w:hanging="360"/>
       </w:pPr>
     </w:lvl>
   </w:abstractNum>
@@ -2038,12 +2004,12 @@
       <w:start w:val="1"/>
       <w:numFmt w:val="bullet"/>
       <w:lvlText w:val=""/>
-      <w:lvlJc w:val="left"/>
+      <w:lvlJc w:val="start"/>
       <w:pPr>
         <w:tabs>
           <w:tab w:val="num" w:pos="490"/>
         </w:tabs>
-        <w:ind w:left="490" w:hanging="245"/>
+        <w:ind w:start="490" w:hanging="245"/>
       </w:pPr>
       <w:rPr>
         <w:rFonts w:ascii="Symbol" w:hAnsi="Symbol" w:cs="Symbol" w:hint="default"/>
@@ -2053,12 +2019,12 @@
       <w:start w:val="1"/>
       <w:numFmt w:val="bullet"/>
       <w:lvlText w:val="◦"/>
-      <w:lvlJc w:val="left"/>
+      <w:lvlJc w:val="start"/>
       <w:pPr>
         <w:tabs>
           <w:tab w:val="num" w:pos="490"/>
         </w:tabs>
-        <w:ind w:left="490" w:hanging="245"/>
+        <w:ind w:start="490" w:hanging="245"/>
       </w:pPr>
       <w:rPr>
         <w:rFonts w:ascii="OpenSymbol" w:hAnsi="OpenSymbol" w:cs="OpenSymbol" w:hint="default"/>
@@ -2068,12 +2034,12 @@
       <w:start w:val="1"/>
       <w:numFmt w:val="bullet"/>
       <w:lvlText w:val="▪"/>
-      <w:lvlJc w:val="left"/>
+      <w:lvlJc w:val="start"/>
       <w:pPr>
         <w:tabs>
           <w:tab w:val="num" w:pos="1492"/>
         </w:tabs>
-        <w:ind w:left="1492" w:hanging="360"/>
+        <w:ind w:start="1492" w:hanging="360"/>
       </w:pPr>
       <w:rPr>
         <w:rFonts w:ascii="OpenSymbol" w:hAnsi="OpenSymbol" w:cs="OpenSymbol" w:hint="default"/>
@@ -2083,12 +2049,12 @@
       <w:start w:val="1"/>
       <w:numFmt w:val="bullet"/>
       <w:lvlText w:val=""/>
-      <w:lvlJc w:val="left"/>
+      <w:lvlJc w:val="start"/>
       <w:pPr>
         <w:tabs>
           <w:tab w:val="num" w:pos="1852"/>
         </w:tabs>
-        <w:ind w:left="1852" w:hanging="360"/>
+        <w:ind w:start="1852" w:hanging="360"/>
       </w:pPr>
       <w:rPr>
         <w:rFonts w:ascii="Symbol" w:hAnsi="Symbol" w:cs="Symbol" w:hint="default"/>
@@ -2098,12 +2064,12 @@
       <w:start w:val="1"/>
       <w:numFmt w:val="bullet"/>
       <w:lvlText w:val="◦"/>
-      <w:lvlJc w:val="left"/>
+      <w:lvlJc w:val="start"/>
       <w:pPr>
         <w:tabs>
           <w:tab w:val="num" w:pos="2212"/>
         </w:tabs>
-        <w:ind w:left="2212" w:hanging="360"/>
+        <w:ind w:start="2212" w:hanging="360"/>
       </w:pPr>
       <w:rPr>
         <w:rFonts w:ascii="OpenSymbol" w:hAnsi="OpenSymbol" w:cs="OpenSymbol" w:hint="default"/>
@@ -2113,12 +2079,12 @@
       <w:start w:val="1"/>
       <w:numFmt w:val="bullet"/>
       <w:lvlText w:val="▪"/>
-      <w:lvlJc w:val="left"/>
+      <w:lvlJc w:val="start"/>
       <w:pPr>
         <w:tabs>
           <w:tab w:val="num" w:pos="2572"/>
         </w:tabs>
-        <w:ind w:left="2572" w:hanging="360"/>
+        <w:ind w:start="2572" w:hanging="360"/>
       </w:pPr>
       <w:rPr>
         <w:rFonts w:ascii="OpenSymbol" w:hAnsi="OpenSymbol" w:cs="OpenSymbol" w:hint="default"/>
@@ -2128,12 +2094,12 @@
       <w:start w:val="1"/>
       <w:numFmt w:val="bullet"/>
       <w:lvlText w:val=""/>
-      <w:lvlJc w:val="left"/>
+      <w:lvlJc w:val="start"/>
       <w:pPr>
         <w:tabs>
           <w:tab w:val="num" w:pos="2932"/>
         </w:tabs>
-        <w:ind w:left="2932" w:hanging="360"/>
+        <w:ind w:start="2932" w:hanging="360"/>
       </w:pPr>
       <w:rPr>
         <w:rFonts w:ascii="Symbol" w:hAnsi="Symbol" w:cs="Symbol" w:hint="default"/>
@@ -2143,12 +2109,12 @@
       <w:start w:val="1"/>
       <w:numFmt w:val="bullet"/>
       <w:lvlText w:val="◦"/>
-      <w:lvlJc w:val="left"/>
+      <w:lvlJc w:val="start"/>
       <w:pPr>
         <w:tabs>
           <w:tab w:val="num" w:pos="3292"/>
         </w:tabs>
-        <w:ind w:left="3292" w:hanging="360"/>
+        <w:ind w:start="3292" w:hanging="360"/>
       </w:pPr>
       <w:rPr>
         <w:rFonts w:ascii="OpenSymbol" w:hAnsi="OpenSymbol" w:cs="OpenSymbol" w:hint="default"/>
@@ -2158,12 +2124,12 @@
       <w:start w:val="1"/>
       <w:numFmt w:val="bullet"/>
       <w:lvlText w:val="▪"/>
-      <w:lvlJc w:val="left"/>
+      <w:lvlJc w:val="start"/>
       <w:pPr>
         <w:tabs>
           <w:tab w:val="num" w:pos="3652"/>
         </w:tabs>
-        <w:ind w:left="3652" w:hanging="360"/>
+        <w:ind w:start="3652" w:hanging="360"/>
       </w:pPr>
       <w:rPr>
         <w:rFonts w:ascii="OpenSymbol" w:hAnsi="OpenSymbol" w:cs="OpenSymbol" w:hint="default"/>
@@ -2175,12 +2141,12 @@
       <w:start w:val="1"/>
       <w:numFmt w:val="bullet"/>
       <w:lvlText w:val=""/>
-      <w:lvlJc w:val="left"/>
+      <w:lvlJc w:val="start"/>
       <w:pPr>
         <w:tabs>
           <w:tab w:val="num" w:pos="504"/>
         </w:tabs>
-        <w:ind w:left="504" w:hanging="216"/>
+        <w:ind w:start="504" w:hanging="216"/>
       </w:pPr>
       <w:rPr>
         <w:rFonts w:ascii="Symbol" w:hAnsi="Symbol" w:cs="Symbol" w:hint="default"/>
@@ -2190,12 +2156,12 @@
       <w:start w:val="1"/>
       <w:numFmt w:val="bullet"/>
       <w:lvlText w:val="◦"/>
-      <w:lvlJc w:val="left"/>
+      <w:lvlJc w:val="start"/>
       <w:pPr>
         <w:tabs>
           <w:tab w:val="num" w:pos="1152"/>
         </w:tabs>
-        <w:ind w:left="1152" w:hanging="360"/>
+        <w:ind w:start="1152" w:hanging="360"/>
       </w:pPr>
       <w:rPr>
         <w:rFonts w:ascii="OpenSymbol" w:hAnsi="OpenSymbol" w:cs="OpenSymbol" w:hint="default"/>
@@ -2205,12 +2171,12 @@
       <w:start w:val="1"/>
       <w:numFmt w:val="bullet"/>
       <w:lvlText w:val="▪"/>
-      <w:lvlJc w:val="left"/>
+      <w:lvlJc w:val="start"/>
       <w:pPr>
         <w:tabs>
           <w:tab w:val="num" w:pos="1512"/>
         </w:tabs>
-        <w:ind w:left="1512" w:hanging="360"/>
+        <w:ind w:start="1512" w:hanging="360"/>
       </w:pPr>
       <w:rPr>
         <w:rFonts w:ascii="OpenSymbol" w:hAnsi="OpenSymbol" w:cs="OpenSymbol" w:hint="default"/>
@@ -2220,12 +2186,12 @@
       <w:start w:val="1"/>
       <w:numFmt w:val="bullet"/>
       <w:lvlText w:val=""/>
-      <w:lvlJc w:val="left"/>
+      <w:lvlJc w:val="start"/>
       <w:pPr>
         <w:tabs>
           <w:tab w:val="num" w:pos="1872"/>
         </w:tabs>
-        <w:ind w:left="1872" w:hanging="360"/>
+        <w:ind w:start="1872" w:hanging="360"/>
       </w:pPr>
       <w:rPr>
         <w:rFonts w:ascii="Symbol" w:hAnsi="Symbol" w:cs="Symbol" w:hint="default"/>
@@ -2235,12 +2201,12 @@
       <w:start w:val="1"/>
       <w:numFmt w:val="bullet"/>
       <w:lvlText w:val="◦"/>
-      <w:lvlJc w:val="left"/>
+      <w:lvlJc w:val="start"/>
       <w:pPr>
         <w:tabs>
           <w:tab w:val="num" w:pos="2232"/>
         </w:tabs>
-        <w:ind w:left="2232" w:hanging="360"/>
+        <w:ind w:start="2232" w:hanging="360"/>
       </w:pPr>
       <w:rPr>
         <w:rFonts w:ascii="OpenSymbol" w:hAnsi="OpenSymbol" w:cs="OpenSymbol" w:hint="default"/>
@@ -2250,12 +2216,12 @@
       <w:start w:val="1"/>
       <w:numFmt w:val="bullet"/>
       <w:lvlText w:val="▪"/>
-      <w:lvlJc w:val="left"/>
+      <w:lvlJc w:val="start"/>
       <w:pPr>
         <w:tabs>
           <w:tab w:val="num" w:pos="2592"/>
         </w:tabs>
-        <w:ind w:left="2592" w:hanging="360"/>
+        <w:ind w:start="2592" w:hanging="360"/>
       </w:pPr>
       <w:rPr>
         <w:rFonts w:ascii="OpenSymbol" w:hAnsi="OpenSymbol" w:cs="OpenSymbol" w:hint="default"/>
@@ -2265,12 +2231,12 @@
       <w:start w:val="1"/>
       <w:numFmt w:val="bullet"/>
       <w:lvlText w:val=""/>
-      <w:lvlJc w:val="left"/>
+      <w:lvlJc w:val="start"/>
       <w:pPr>
         <w:tabs>
           <w:tab w:val="num" w:pos="2952"/>
         </w:tabs>
-        <w:ind w:left="2952" w:hanging="360"/>
+        <w:ind w:start="2952" w:hanging="360"/>
       </w:pPr>
       <w:rPr>
         <w:rFonts w:ascii="Symbol" w:hAnsi="Symbol" w:cs="Symbol" w:hint="default"/>
@@ -2280,12 +2246,12 @@
       <w:start w:val="1"/>
       <w:numFmt w:val="bullet"/>
       <w:lvlText w:val="◦"/>
-      <w:lvlJc w:val="left"/>
+      <w:lvlJc w:val="start"/>
       <w:pPr>
         <w:tabs>
           <w:tab w:val="num" w:pos="3312"/>
         </w:tabs>
-        <w:ind w:left="3312" w:hanging="360"/>
+        <w:ind w:start="3312" w:hanging="360"/>
       </w:pPr>
       <w:rPr>
         <w:rFonts w:ascii="OpenSymbol" w:hAnsi="OpenSymbol" w:cs="OpenSymbol" w:hint="default"/>
@@ -2295,12 +2261,12 @@
       <w:start w:val="1"/>
       <w:numFmt w:val="bullet"/>
       <w:lvlText w:val="▪"/>
-      <w:lvlJc w:val="left"/>
+      <w:lvlJc w:val="start"/>
       <w:pPr>
         <w:tabs>
           <w:tab w:val="num" w:pos="3672"/>
         </w:tabs>
-        <w:ind w:left="3672" w:hanging="360"/>
+        <w:ind w:start="3672" w:hanging="360"/>
       </w:pPr>
       <w:rPr>
         <w:rFonts w:ascii="OpenSymbol" w:hAnsi="OpenSymbol" w:cs="OpenSymbol" w:hint="default"/>
@@ -2312,12 +2278,12 @@
       <w:start w:val="1"/>
       <w:numFmt w:val="bullet"/>
       <w:lvlText w:val=""/>
-      <w:lvlJc w:val="left"/>
+      <w:lvlJc w:val="start"/>
       <w:pPr>
         <w:tabs>
           <w:tab w:val="num" w:pos="504"/>
         </w:tabs>
-        <w:ind w:left="504" w:hanging="216"/>
+        <w:ind w:start="504" w:hanging="216"/>
       </w:pPr>
       <w:rPr>
         <w:rFonts w:ascii="Symbol" w:hAnsi="Symbol" w:cs="Symbol" w:hint="default"/>
@@ -2327,12 +2293,12 @@
       <w:start w:val="1"/>
       <w:numFmt w:val="bullet"/>
       <w:lvlText w:val="◦"/>
-      <w:lvlJc w:val="left"/>
+      <w:lvlJc w:val="start"/>
       <w:pPr>
         <w:tabs>
           <w:tab w:val="num" w:pos="1080"/>
         </w:tabs>
-        <w:ind w:left="1080" w:hanging="360"/>
+        <w:ind w:start="1080" w:hanging="360"/>
       </w:pPr>
       <w:rPr>
         <w:rFonts w:ascii="OpenSymbol" w:hAnsi="OpenSymbol" w:cs="OpenSymbol" w:hint="default"/>
@@ -2342,12 +2308,12 @@
       <w:start w:val="1"/>
       <w:numFmt w:val="bullet"/>
       <w:lvlText w:val="▪"/>
-      <w:lvlJc w:val="left"/>
+      <w:lvlJc w:val="start"/>
       <w:pPr>
         <w:tabs>
           <w:tab w:val="num" w:pos="1440"/>
         </w:tabs>
-        <w:ind w:left="1440" w:hanging="360"/>
+        <w:ind w:start="1440" w:hanging="360"/>
       </w:pPr>
       <w:rPr>
         <w:rFonts w:ascii="OpenSymbol" w:hAnsi="OpenSymbol" w:cs="OpenSymbol" w:hint="default"/>
@@ -2357,12 +2323,12 @@
       <w:start w:val="1"/>
       <w:numFmt w:val="bullet"/>
       <w:lvlText w:val=""/>
-      <w:lvlJc w:val="left"/>
+      <w:lvlJc w:val="start"/>
       <w:pPr>
         <w:tabs>
           <w:tab w:val="num" w:pos="1800"/>
         </w:tabs>
-        <w:ind w:left="1800" w:hanging="360"/>
+        <w:ind w:start="1800" w:hanging="360"/>
       </w:pPr>
       <w:rPr>
         <w:rFonts w:ascii="Symbol" w:hAnsi="Symbol" w:cs="Symbol" w:hint="default"/>
@@ -2372,12 +2338,12 @@
       <w:start w:val="1"/>
       <w:numFmt w:val="bullet"/>
       <w:lvlText w:val="◦"/>
-      <w:lvlJc w:val="left"/>
+      <w:lvlJc w:val="start"/>
       <w:pPr>
         <w:tabs>
           <w:tab w:val="num" w:pos="2160"/>
         </w:tabs>
-        <w:ind w:left="2160" w:hanging="360"/>
+        <w:ind w:start="2160" w:hanging="360"/>
       </w:pPr>
       <w:rPr>
         <w:rFonts w:ascii="OpenSymbol" w:hAnsi="OpenSymbol" w:cs="OpenSymbol" w:hint="default"/>
@@ -2387,12 +2353,12 @@
       <w:start w:val="1"/>
       <w:numFmt w:val="bullet"/>
       <w:lvlText w:val="▪"/>
-      <w:lvlJc w:val="left"/>
+      <w:lvlJc w:val="start"/>
       <w:pPr>
         <w:tabs>
           <w:tab w:val="num" w:pos="2520"/>
         </w:tabs>
-        <w:ind w:left="2520" w:hanging="360"/>
+        <w:ind w:start="2520" w:hanging="360"/>
       </w:pPr>
       <w:rPr>
         <w:rFonts w:ascii="OpenSymbol" w:hAnsi="OpenSymbol" w:cs="OpenSymbol" w:hint="default"/>
@@ -2402,12 +2368,12 @@
       <w:start w:val="1"/>
       <w:numFmt w:val="bullet"/>
       <w:lvlText w:val=""/>
-      <w:lvlJc w:val="left"/>
+      <w:lvlJc w:val="start"/>
       <w:pPr>
         <w:tabs>
           <w:tab w:val="num" w:pos="2880"/>
         </w:tabs>
-        <w:ind w:left="2880" w:hanging="360"/>
+        <w:ind w:start="2880" w:hanging="360"/>
       </w:pPr>
       <w:rPr>
         <w:rFonts w:ascii="Symbol" w:hAnsi="Symbol" w:cs="Symbol" w:hint="default"/>
@@ -2417,12 +2383,12 @@
       <w:start w:val="1"/>
       <w:numFmt w:val="bullet"/>
       <w:lvlText w:val="◦"/>
-      <w:lvlJc w:val="left"/>
+      <w:lvlJc w:val="start"/>
       <w:pPr>
         <w:tabs>
           <w:tab w:val="num" w:pos="3240"/>
         </w:tabs>
-        <w:ind w:left="3240" w:hanging="360"/>
+        <w:ind w:start="3240" w:hanging="360"/>
       </w:pPr>
       <w:rPr>
         <w:rFonts w:ascii="OpenSymbol" w:hAnsi="OpenSymbol" w:cs="OpenSymbol" w:hint="default"/>
@@ -2432,12 +2398,12 @@
       <w:start w:val="1"/>
       <w:numFmt w:val="bullet"/>
       <w:lvlText w:val="▪"/>
-      <w:lvlJc w:val="left"/>
+      <w:lvlJc w:val="start"/>
       <w:pPr>
         <w:tabs>
           <w:tab w:val="num" w:pos="3600"/>
         </w:tabs>
-        <w:ind w:left="3600" w:hanging="360"/>
+        <w:ind w:start="3600" w:hanging="360"/>
       </w:pPr>
       <w:rPr>
         <w:rFonts w:ascii="OpenSymbol" w:hAnsi="OpenSymbol" w:cs="OpenSymbol" w:hint="default"/>
@@ -2449,12 +2415,12 @@
       <w:start w:val="1"/>
       <w:numFmt w:val="bullet"/>
       <w:lvlText w:val=""/>
-      <w:lvlJc w:val="left"/>
+      <w:lvlJc w:val="start"/>
       <w:pPr>
         <w:tabs>
           <w:tab w:val="num" w:pos="504"/>
         </w:tabs>
-        <w:ind w:left="504" w:hanging="216"/>
+        <w:ind w:start="504" w:hanging="216"/>
       </w:pPr>
       <w:rPr>
         <w:rFonts w:ascii="Symbol" w:hAnsi="Symbol" w:cs="Symbol" w:hint="default"/>
@@ -2464,12 +2430,12 @@
       <w:start w:val="1"/>
       <w:numFmt w:val="bullet"/>
       <w:lvlText w:val="◦"/>
-      <w:lvlJc w:val="left"/>
+      <w:lvlJc w:val="start"/>
       <w:pPr>
         <w:tabs>
           <w:tab w:val="num" w:pos="864"/>
         </w:tabs>
-        <w:ind w:left="864" w:hanging="360"/>
+        <w:ind w:start="864" w:hanging="360"/>
       </w:pPr>
       <w:rPr>
         <w:rFonts w:ascii="OpenSymbol" w:hAnsi="OpenSymbol" w:cs="OpenSymbol" w:hint="default"/>
@@ -2479,12 +2445,12 @@
       <w:start w:val="1"/>
       <w:numFmt w:val="bullet"/>
       <w:lvlText w:val="▪"/>
-      <w:lvlJc w:val="left"/>
+      <w:lvlJc w:val="start"/>
       <w:pPr>
         <w:tabs>
           <w:tab w:val="num" w:pos="1440"/>
         </w:tabs>
-        <w:ind w:left="1440" w:hanging="360"/>
+        <w:ind w:start="1440" w:hanging="360"/>
       </w:pPr>
       <w:rPr>
         <w:rFonts w:ascii="OpenSymbol" w:hAnsi="OpenSymbol" w:cs="OpenSymbol" w:hint="default"/>
@@ -2494,12 +2460,12 @@
       <w:start w:val="1"/>
       <w:numFmt w:val="bullet"/>
       <w:lvlText w:val=""/>
-      <w:lvlJc w:val="left"/>
+      <w:lvlJc w:val="start"/>
       <w:pPr>
         <w:tabs>
           <w:tab w:val="num" w:pos="1800"/>
         </w:tabs>
-        <w:ind w:left="1800" w:hanging="360"/>
+        <w:ind w:start="1800" w:hanging="360"/>
       </w:pPr>
       <w:rPr>
         <w:rFonts w:ascii="Symbol" w:hAnsi="Symbol" w:cs="Symbol" w:hint="default"/>
@@ -2509,12 +2475,12 @@
       <w:start w:val="1"/>
       <w:numFmt w:val="bullet"/>
       <w:lvlText w:val="◦"/>
-      <w:lvlJc w:val="left"/>
+      <w:lvlJc w:val="start"/>
       <w:pPr>
         <w:tabs>
           <w:tab w:val="num" w:pos="2160"/>
         </w:tabs>
-        <w:ind w:left="2160" w:hanging="360"/>
+        <w:ind w:start="2160" w:hanging="360"/>
       </w:pPr>
       <w:rPr>
         <w:rFonts w:ascii="OpenSymbol" w:hAnsi="OpenSymbol" w:cs="OpenSymbol" w:hint="default"/>
@@ -2524,12 +2490,12 @@
       <w:start w:val="1"/>
       <w:numFmt w:val="bullet"/>
       <w:lvlText w:val="▪"/>
-      <w:lvlJc w:val="left"/>
+      <w:lvlJc w:val="start"/>
       <w:pPr>
         <w:tabs>
           <w:tab w:val="num" w:pos="2520"/>
         </w:tabs>
-        <w:ind w:left="2520" w:hanging="360"/>
+        <w:ind w:start="2520" w:hanging="360"/>
       </w:pPr>
       <w:rPr>
         <w:rFonts w:ascii="OpenSymbol" w:hAnsi="OpenSymbol" w:cs="OpenSymbol" w:hint="default"/>
@@ -2539,12 +2505,12 @@
       <w:start w:val="1"/>
       <w:numFmt w:val="bullet"/>
       <w:lvlText w:val=""/>
-      <w:lvlJc w:val="left"/>
+      <w:lvlJc w:val="start"/>
       <w:pPr>
         <w:tabs>
           <w:tab w:val="num" w:pos="2880"/>
         </w:tabs>
-        <w:ind w:left="2880" w:hanging="360"/>
+        <w:ind w:start="2880" w:hanging="360"/>
       </w:pPr>
       <w:rPr>
         <w:rFonts w:ascii="Symbol" w:hAnsi="Symbol" w:cs="Symbol" w:hint="default"/>
@@ -2554,12 +2520,12 @@
       <w:start w:val="1"/>
       <w:numFmt w:val="bullet"/>
       <w:lvlText w:val="◦"/>
-      <w:lvlJc w:val="left"/>
+      <w:lvlJc w:val="start"/>
       <w:pPr>
         <w:tabs>
           <w:tab w:val="num" w:pos="3240"/>
         </w:tabs>
-        <w:ind w:left="3240" w:hanging="360"/>
+        <w:ind w:start="3240" w:hanging="360"/>
       </w:pPr>
       <w:rPr>
         <w:rFonts w:ascii="OpenSymbol" w:hAnsi="OpenSymbol" w:cs="OpenSymbol" w:hint="default"/>
@@ -2569,12 +2535,12 @@
       <w:start w:val="1"/>
       <w:numFmt w:val="bullet"/>
       <w:lvlText w:val="▪"/>
-      <w:lvlJc w:val="left"/>
+      <w:lvlJc w:val="start"/>
       <w:pPr>
         <w:tabs>
           <w:tab w:val="num" w:pos="3600"/>
         </w:tabs>
-        <w:ind w:left="3600" w:hanging="360"/>
+        <w:ind w:start="3600" w:hanging="360"/>
       </w:pPr>
       <w:rPr>
         <w:rFonts w:ascii="OpenSymbol" w:hAnsi="OpenSymbol" w:cs="OpenSymbol" w:hint="default"/>
@@ -2636,8 +2602,8 @@
       <w:autoSpaceDE w:val="true"/>
       <w:bidi w:val="0"/>
       <w:spacing w:before="0" w:after="0"/>
-      <w:ind w:hanging="0" w:left="72" w:right="0"/>
-      <w:jc w:val="left"/>
+      <w:ind w:hanging="0" w:start="72" w:end="0"/>
+      <w:jc w:val="start"/>
     </w:pPr>
     <w:rPr>
       <w:rFonts w:ascii="Open Sans" w:hAnsi="Open Sans" w:eastAsia="Noto Serif CJK SC" w:cs="Lohit Devanagari"/>
@@ -2893,7 +2859,7 @@
         <w:tab w:val="clear" w:pos="264"/>
         <w:tab w:val="left" w:pos="2835" w:leader="none"/>
       </w:tabs>
-      <w:ind w:hanging="2551" w:left="2835" w:right="0"/>
+      <w:ind w:hanging="2551" w:start="2835" w:end="0"/>
     </w:pPr>
     <w:rPr/>
   </w:style>
@@ -2903,8 +2869,8 @@
     <w:qFormat/>
     <w:pPr>
       <w:spacing w:before="0" w:after="0"/>
-      <w:ind w:hanging="0" w:left="72" w:right="0"/>
-      <w:jc w:val="left"/>
+      <w:ind w:hanging="0" w:start="72" w:end="0"/>
+      <w:jc w:val="start"/>
     </w:pPr>
     <w:rPr>
       <w:rFonts w:ascii="Open Sans" w:hAnsi="Open Sans"/>

</xml_diff>